<commit_message>
add gif, update README
</commit_message>
<xml_diff>
--- a/Quotes to tests/Zitate de-DE - Richard Stallman.docx
+++ b/Quotes to tests/Zitate de-DE - Richard Stallman.docx
@@ -8,6 +8,8 @@
           <w:rFonts w:hint="default"/>
         </w:rPr>
       </w:pPr>
+      <w:bookmarkStart w:id="0" w:name="_GoBack"/>
+      <w:bookmarkEnd w:id="0"/>
     </w:p>
     <w:p>
       <w:pPr>
@@ -95,8 +97,6 @@
           <w:rFonts w:hint="default"/>
         </w:rPr>
       </w:pPr>
-      <w:bookmarkStart w:id="0" w:name="_GoBack"/>
-      <w:bookmarkEnd w:id="0"/>
       <w:r>
         <w:rPr>
           <w:rFonts w:hint="default"/>
@@ -106,7 +106,7 @@
     </w:p>
     <w:sectPr>
       <w:pgSz w:w="11906" w:h="16838"/>
-      <w:pgMar w:top="1440" w:right="1800" w:bottom="1440" w:left="1800" w:header="720" w:footer="720" w:gutter="0"/>
+      <w:pgMar w:top="720" w:right="720" w:bottom="720" w:left="720" w:header="720" w:footer="720" w:gutter="0"/>
       <w:cols w:space="720" w:num="1"/>
       <w:docGrid w:linePitch="360" w:charSpace="0"/>
     </w:sectPr>

</xml_diff>